<commit_message>
Corrige la sección de importación CSV en el Manual de Usuario
Decía que el CSV acepta columnas de usuario y rol, pero el código solo lee nombre y correo (el rol siempre queda en estudiante) — corregido. También faltaba documentar la opción de inscribir automáticamente a los importados en un curso, que sí existe en la pantalla real.

Co-Authored-By: Claude Sonnet 5 <noreply@anthropic.com>
</commit_message>
<xml_diff>
--- a/docs/Manual_Usuario_LMS_CeNAT.docx
+++ b/docs/Manual_Usuario_LMS_CeNAT.docx
@@ -1552,52 +1552,52 @@
         <w:pStyle w:val="Ttulo2"/>
       </w:pPr>
       <w:r>
+        <w:t>2.21 Módulos de Curso</w:t>
+      </w:r>
+    </w:p>
+    <w:p>
+      <w:pPr>
+        <w:pStyle w:val="Prrafodelista"/>
+      </w:pPr>
+      <w:r>
+        <w:t>Algunos cursos están organizados en módulos, cada uno con sus propios cursos más pequeños adentro</w:t>
+      </w:r>
+    </w:p>
+    <w:p>
+      <w:pPr>
+        <w:pStyle w:val="Prrafodelista"/>
+      </w:pPr>
+      <w:r>
+        <w:t>Si un curso tiene módulos, aparece un selector ("Módulo 1: ...", "Módulo 2: ...") en su página de detalle</w:t>
+      </w:r>
+    </w:p>
+    <w:p>
+      <w:pPr>
+        <w:pStyle w:val="Prrafodelista"/>
+      </w:pPr>
+      <w:r>
+        <w:t>Elegir un módulo muestra las tarjetas de sus cursos; hacer clic en una tarjeta para entrar a ese curso</w:t>
+      </w:r>
+    </w:p>
+    <w:p>
+      <w:pPr>
+        <w:pStyle w:val="Prrafodelista"/>
+      </w:pPr>
+      <w:r>
+        <w:t>Inscribirse en el curso principal te da acceso a todos sus módulos; el progreso y el certificado se calculan sobre el conjunto completo</w:t>
+      </w:r>
+    </w:p>
+    <w:p>
+      <w:pPr>
+        <w:pStyle w:val="Ttulo1"/>
+      </w:pPr>
+      <w:r>
+        <w:t>3. Guía para Profesores</w:t>
+      </w:r>
+    </w:p>
+    <w:p>
+      <w:r>
         <w:lastRenderedPageBreak/>
-        <w:t>2.21 Módulos de Curso</w:t>
-      </w:r>
-    </w:p>
-    <w:p>
-      <w:pPr>
-        <w:pStyle w:val="Prrafodelista"/>
-      </w:pPr>
-      <w:r>
-        <w:t>Algunos cursos están organizados en módulos, cada uno con sus propios cursos más pequeños adentro</w:t>
-      </w:r>
-    </w:p>
-    <w:p>
-      <w:pPr>
-        <w:pStyle w:val="Prrafodelista"/>
-      </w:pPr>
-      <w:r>
-        <w:t>Si un curso tiene módulos, aparece un selector ("Módulo 1: ...", "Módulo 2: ...") en su página de detalle</w:t>
-      </w:r>
-    </w:p>
-    <w:p>
-      <w:pPr>
-        <w:pStyle w:val="Prrafodelista"/>
-      </w:pPr>
-      <w:r>
-        <w:t>Elegir un módulo muestra las tarjetas de sus cursos; hacer clic en una tarjeta para entrar a ese curso</w:t>
-      </w:r>
-    </w:p>
-    <w:p>
-      <w:pPr>
-        <w:pStyle w:val="Prrafodelista"/>
-      </w:pPr>
-      <w:r>
-        <w:t>Inscribirse en el curso principal te da acceso a todos sus módulos; el progreso y el certificado se calculan sobre el conjunto completo</w:t>
-      </w:r>
-    </w:p>
-    <w:p>
-      <w:pPr>
-        <w:pStyle w:val="Ttulo1"/>
-      </w:pPr>
-      <w:r>
-        <w:t>3. Guía para Profesores</w:t>
-      </w:r>
-    </w:p>
-    <w:p>
-      <w:r>
         <w:t>Un profesor tiene acceso a los cursos que un administrador le asignó. Puede gestionar el contenido de esos cursos y hacer seguimiento de sus estudiantes, sin acceso al resto del panel de administración (gestión de usuarios, estadísticas globales, u otros cursos).</w:t>
       </w:r>
     </w:p>
@@ -1858,7 +1858,6 @@
         </w:numPr>
       </w:pPr>
       <w:r>
-        <w:lastRenderedPageBreak/>
         <w:t>Hacer clic en "Resultados" junto a un cuestionario o encuesta</w:t>
       </w:r>
     </w:p>
@@ -2357,7 +2356,6 @@
         <w:spacing w:after="80"/>
       </w:pPr>
       <w:r>
-        <w:lastRenderedPageBreak/>
         <w:t>Seleccionar el documento (PDF, DOCX, PPTX, XLSX, ZIP, RAR — máx. 50 MB)</w:t>
       </w:r>
     </w:p>
@@ -2736,7 +2734,6 @@
         <w:spacing w:after="80"/>
       </w:pPr>
       <w:r>
-        <w:lastRenderedPageBreak/>
         <w:t>Hacer clic en el ícono de birrete (🎓) junto al curso deseado, en la columna de acciones</w:t>
       </w:r>
     </w:p>
@@ -2883,7 +2880,15 @@
         <w:pStyle w:val="Prrafodelista"/>
       </w:pPr>
       <w:r>
-        <w:t>Seleccionar un archivo CSV con las columnas de nombre, correo, usuario y rol (hasta 100 filas por importación)</w:t>
+        <w:t>Seleccionar un archivo CSV con las columnas de nombre y correo (hasta 100 filas por importación) — todos se crean con rol de estudiante</w:t>
+      </w:r>
+    </w:p>
+    <w:p>
+      <w:pPr>
+        <w:pStyle w:val="Prrafodelista"/>
+      </w:pPr>
+      <w:r>
+        <w:t>Opcionalmente, elegir un curso para inscribir automáticamente a cada estudiante importado (también a los que ya tenían cuenta)</w:t>
       </w:r>
     </w:p>
     <w:p>
@@ -2899,7 +2904,7 @@
         <w:pStyle w:val="Prrafodelista"/>
       </w:pPr>
       <w:r>
-        <w:t>Cada usuario creado recibe un correo de bienvenida con sus credenciales</w:t>
+        <w:t>Cada usuario nuevo recibe un correo de bienvenida con sus credenciales</w:t>
       </w:r>
     </w:p>
     <w:p>

</xml_diff>